<commit_message>
Prep dark mode demo: CSS pre-baked, toggle removed for live add
Dark mode CSS variables and .theme-toggle styles are in place but inactive.
During demo, ask Copilot to add the toggle UI + JS for a fast live feature add.

Co-authored-by: Copilot <223556219+Copilot@users.noreply.github.com>
</commit_message>
<xml_diff>
--- a/Zava_Insurance_Hybrid_AI_Demo_Guide.docx
+++ b/Zava_Insurance_Hybrid_AI_Demo_Guide.docx
@@ -263,17 +263,33 @@
       <w:r>
         <w:t>ACTION:</w:t>
         <w:br/>
-        <w:t>1. Click 'Claims AI' tab</w:t>
+        <w:t>1. Click ‘Claims AI’ tab</w:t>
         <w:br/>
-        <w:t>2. Drag a water damage photo from sample_data/claim_photos/ into the upload area</w:t>
+        <w:t>2. Upload the 5 flooded kitchen photos from sample_data/claim_photos/:</w:t>
         <w:br/>
-        <w:t>3. Select 'Water Damage' as damage type</w:t>
+        <w:t xml:space="preserve">   • IMG_0148 - Copy.JPG (basement water damage overview)</w:t>
         <w:br/>
-        <w:t>4. Click 'Assess with On-Device AI'</w:t>
+        <w:t xml:space="preserve">   • IMG_0150.JPG (water line on walls)</w:t>
         <w:br/>
-        <w:t>5. Point out the response time (~8-12 seconds) and that it says 'Engine: NPU'</w:t>
+        <w:t xml:space="preserve">   • IMG_0166.JPG (flooring damage)</w:t>
         <w:br/>
-        <w:t>6. Open Task Manager (Ctrl+Shift+Esc) → Performance tab → show NPU utilization spike</w:t>
+        <w:t xml:space="preserve">   • IMG_0169.png (damage detail – drywall cutout behind dishwasher)</w:t>
+        <w:br/>
+        <w:t xml:space="preserve">   • IMG_9165.png (additional damage area)</w:t>
+        <w:br/>
+        <w:t xml:space="preserve">   Drag all 5 into the upload zone at once, or click to browse and select them.</w:t>
+        <w:br/>
+        <w:t>3. Select ‘Water Damage’ as damage type</w:t>
+        <w:br/>
+        <w:t>4. In the Notes field, type or paste:</w:t>
+        <w:br/>
+        <w:t xml:space="preserve">   "Home owner is reporting water damage. Water likely either coming from the ceiling or through a leaky pipe in the wall. Drywall cutout behind dishwasher is showing water damage of the wooden framing and subfloor."</w:t>
+        <w:br/>
+        <w:t>5. Click ‘Assess with On-Device AI’</w:t>
+        <w:br/>
+        <w:t>6. Point out the response time (~8-12 seconds) and that it says ‘Engine: NPU’</w:t>
+        <w:br/>
+        <w:t>7. Open Task Manager (Ctrl+Shift+Esc) → Performance tab → show NPU utilization spike</w:t>
       </w:r>
     </w:p>
     <w:p>

</xml_diff>